<commit_message>
update the  Dijkstra’s image graph
</commit_message>
<xml_diff>
--- a/problem_solving_techniques/Phase 2: Algorithms Mastery/greedy algorithms/greedy_workthout_example_on_solving_problems.docx
+++ b/problem_solving_techniques/Phase 2: Algorithms Mastery/greedy algorithms/greedy_workthout_example_on_solving_problems.docx
@@ -30,7 +30,10 @@
         </w:rPr>
       </w:pPr>
       <w:r>
-        <w:rPr/>
+        <w:rPr>
+          <w:b/>
+          <w:bCs/>
+        </w:rPr>
       </w:r>
     </w:p>
     <w:p>
@@ -882,7 +885,10 @@
         </w:rPr>
       </w:pPr>
       <w:r>
-        <w:rPr/>
+        <w:rPr>
+          <w:b/>
+          <w:bCs/>
+        </w:rPr>
       </w:r>
     </w:p>
     <w:p>
@@ -898,14 +904,7 @@
           <w:b/>
           <w:bCs/>
         </w:rPr>
-        <w:t xml:space="preserve">2. </w:t>
-      </w:r>
-      <w:r>
-        <w:rPr>
-          <w:b/>
-          <w:bCs/>
-        </w:rPr>
-        <w:t>Step-by-Step Workthrough for the Activity Selection Problem</w:t>
+        <w:t>2. Step-by-Step Workthrough for the Activity Selection Problem</w:t>
       </w:r>
     </w:p>
     <w:p>
@@ -2388,7 +2387,10 @@
         </w:rPr>
       </w:pPr>
       <w:r>
-        <w:rPr/>
+        <w:rPr>
+          <w:b/>
+          <w:bCs/>
+        </w:rPr>
       </w:r>
     </w:p>
     <w:p>
@@ -3309,15 +3311,7 @@
       </w:pPr>
       <w:r>
         <w:rPr/>
-        <w:t xml:space="preserve">Fractional Value: </w:t>
-      </w:r>
-      <w:r>
-        <w:rPr/>
-        <w:t>20/30</w:t>
-      </w:r>
-      <w:r>
-        <w:rPr/>
-        <w:t>​×120=80</w:t>
+        <w:t>Fractional Value: 20/30​×120=80</w:t>
       </w:r>
     </w:p>
     <w:p>
@@ -3431,11 +3425,7 @@
       </w:pPr>
       <w:r>
         <w:rPr/>
-        <w:t>4 .</w:t>
-      </w:r>
-      <w:r>
-        <w:rPr/>
-        <w:t>Workthrough: Minimum Number of Platforms Required</w:t>
+        <w:t>4 .Workthrough: Minimum Number of Platforms Required</w:t>
       </w:r>
     </w:p>
     <w:p>
@@ -4542,11 +4532,7 @@
       </w:pPr>
       <w:r>
         <w:rPr/>
-        <w:t xml:space="preserve">5. </w:t>
-      </w:r>
-      <w:r>
-        <w:rPr/>
-        <w:t>Job Sequencing Problem: Workthrough Document</w:t>
+        <w:t>5. Job Sequencing Problem: Workthrough Document</w:t>
       </w:r>
     </w:p>
     <w:p>
@@ -6336,7 +6322,10 @@
         </w:rPr>
       </w:pPr>
       <w:r>
-        <w:rPr/>
+        <w:rPr>
+          <w:b/>
+          <w:bCs/>
+        </w:rPr>
       </w:r>
     </w:p>
     <w:p>
@@ -6601,6 +6590,461 @@
           <w:rStyle w:val="SourceText"/>
         </w:rPr>
         <w:t>}</w:t>
+      </w:r>
+    </w:p>
+    <w:p>
+      <w:pPr>
+        <w:pStyle w:val="PreformattedText"/>
+        <w:bidi w:val="0"/>
+        <w:spacing w:before="0" w:after="283"/>
+        <w:rPr>
+          <w:rStyle w:val="SourceText"/>
+        </w:rPr>
+      </w:pPr>
+      <w:r>
+        <w:rPr/>
+        <w:drawing>
+          <wp:anchor behindDoc="0" distT="0" distB="0" distL="0" distR="0" simplePos="0" locked="0" layoutInCell="0" allowOverlap="1" relativeHeight="2">
+            <wp:simplePos x="0" y="0"/>
+            <wp:positionH relativeFrom="column">
+              <wp:align>center</wp:align>
+            </wp:positionH>
+            <wp:positionV relativeFrom="paragraph">
+              <wp:posOffset>635</wp:posOffset>
+            </wp:positionV>
+            <wp:extent cx="6120130" cy="4978400"/>
+            <wp:effectExtent l="0" t="0" r="0" b="0"/>
+            <wp:wrapSquare wrapText="largest"/>
+            <wp:docPr id="1" name="Image1" descr="" title=""/>
+            <wp:cNvGraphicFramePr>
+              <a:graphicFrameLocks xmlns:a="http://schemas.openxmlformats.org/drawingml/2006/main" noChangeAspect="1"/>
+            </wp:cNvGraphicFramePr>
+            <a:graphic xmlns:a="http://schemas.openxmlformats.org/drawingml/2006/main">
+              <a:graphicData uri="http://schemas.openxmlformats.org/drawingml/2006/picture">
+                <pic:pic xmlns:pic="http://schemas.openxmlformats.org/drawingml/2006/picture">
+                  <pic:nvPicPr>
+                    <pic:cNvPr id="1" name="Image1" descr="" title=""/>
+                    <pic:cNvPicPr>
+                      <a:picLocks noChangeAspect="1" noChangeArrowheads="1"/>
+                    </pic:cNvPicPr>
+                  </pic:nvPicPr>
+                  <pic:blipFill>
+                    <a:blip r:embed="rId2"/>
+                    <a:stretch>
+                      <a:fillRect/>
+                    </a:stretch>
+                  </pic:blipFill>
+                  <pic:spPr bwMode="auto">
+                    <a:xfrm>
+                      <a:off x="0" y="0"/>
+                      <a:ext cx="6120130" cy="4978400"/>
+                    </a:xfrm>
+                    <a:prstGeom prst="rect">
+                      <a:avLst/>
+                    </a:prstGeom>
+                  </pic:spPr>
+                </pic:pic>
+              </a:graphicData>
+            </a:graphic>
+          </wp:anchor>
+        </w:drawing>
+      </w:r>
+    </w:p>
+    <w:p>
+      <w:pPr>
+        <w:pStyle w:val="Heading3"/>
+        <w:bidi w:val="0"/>
+        <w:spacing w:lineRule="auto" w:line="276" w:before="0" w:after="140"/>
+        <w:jc w:val="start"/>
+        <w:rPr/>
+      </w:pPr>
+      <w:r>
+        <w:rPr>
+          <w:rStyle w:val="Strong"/>
+          <w:b/>
+          <w:bCs/>
+        </w:rPr>
+        <w:t>Shortest Distances</w:t>
+      </w:r>
+      <w:r>
+        <w:rPr/>
+        <w:t>:</w:t>
+      </w:r>
+    </w:p>
+    <w:p>
+      <w:pPr>
+        <w:pStyle w:val="BodyText"/>
+        <w:numPr>
+          <w:ilvl w:val="0"/>
+          <w:numId w:val="103"/>
+        </w:numPr>
+        <w:tabs>
+          <w:tab w:val="clear" w:pos="709"/>
+          <w:tab w:val="left" w:pos="0" w:leader="none"/>
+        </w:tabs>
+        <w:spacing w:before="0" w:after="0"/>
+        <w:ind w:hanging="283" w:start="709"/>
+        <w:rPr/>
+      </w:pPr>
+      <w:r>
+        <w:rPr/>
+        <w:t>Distance to Node 0: 0</w:t>
+      </w:r>
+    </w:p>
+    <w:p>
+      <w:pPr>
+        <w:pStyle w:val="BodyText"/>
+        <w:numPr>
+          <w:ilvl w:val="0"/>
+          <w:numId w:val="103"/>
+        </w:numPr>
+        <w:tabs>
+          <w:tab w:val="clear" w:pos="709"/>
+          <w:tab w:val="left" w:pos="0" w:leader="none"/>
+        </w:tabs>
+        <w:spacing w:before="0" w:after="0"/>
+        <w:ind w:hanging="283" w:start="709"/>
+        <w:rPr/>
+      </w:pPr>
+      <w:r>
+        <w:rPr/>
+        <w:t>Distance to Node 1: 4</w:t>
+      </w:r>
+    </w:p>
+    <w:p>
+      <w:pPr>
+        <w:pStyle w:val="BodyText"/>
+        <w:numPr>
+          <w:ilvl w:val="0"/>
+          <w:numId w:val="103"/>
+        </w:numPr>
+        <w:tabs>
+          <w:tab w:val="clear" w:pos="709"/>
+          <w:tab w:val="left" w:pos="0" w:leader="none"/>
+        </w:tabs>
+        <w:spacing w:before="0" w:after="0"/>
+        <w:ind w:hanging="283" w:start="709"/>
+        <w:rPr/>
+      </w:pPr>
+      <w:r>
+        <w:rPr/>
+        <w:t>Distance to Node 7: 8</w:t>
+      </w:r>
+    </w:p>
+    <w:p>
+      <w:pPr>
+        <w:pStyle w:val="BodyText"/>
+        <w:numPr>
+          <w:ilvl w:val="0"/>
+          <w:numId w:val="103"/>
+        </w:numPr>
+        <w:tabs>
+          <w:tab w:val="clear" w:pos="709"/>
+          <w:tab w:val="left" w:pos="0" w:leader="none"/>
+        </w:tabs>
+        <w:spacing w:before="0" w:after="0"/>
+        <w:ind w:hanging="283" w:start="709"/>
+        <w:rPr/>
+      </w:pPr>
+      <w:r>
+        <w:rPr/>
+        <w:t>Distance to Node 6: 9</w:t>
+      </w:r>
+    </w:p>
+    <w:p>
+      <w:pPr>
+        <w:pStyle w:val="BodyText"/>
+        <w:numPr>
+          <w:ilvl w:val="0"/>
+          <w:numId w:val="103"/>
+        </w:numPr>
+        <w:tabs>
+          <w:tab w:val="clear" w:pos="709"/>
+          <w:tab w:val="left" w:pos="0" w:leader="none"/>
+        </w:tabs>
+        <w:spacing w:before="0" w:after="0"/>
+        <w:ind w:hanging="283" w:start="709"/>
+        <w:rPr/>
+      </w:pPr>
+      <w:r>
+        <w:rPr/>
+        <w:t>Distance to Node 5: 11</w:t>
+      </w:r>
+    </w:p>
+    <w:p>
+      <w:pPr>
+        <w:pStyle w:val="BodyText"/>
+        <w:numPr>
+          <w:ilvl w:val="0"/>
+          <w:numId w:val="103"/>
+        </w:numPr>
+        <w:tabs>
+          <w:tab w:val="clear" w:pos="709"/>
+          <w:tab w:val="left" w:pos="0" w:leader="none"/>
+        </w:tabs>
+        <w:spacing w:before="0" w:after="0"/>
+        <w:ind w:hanging="283" w:start="709"/>
+        <w:rPr/>
+      </w:pPr>
+      <w:r>
+        <w:rPr/>
+        <w:t>Distance to Node 2: 12</w:t>
+      </w:r>
+    </w:p>
+    <w:p>
+      <w:pPr>
+        <w:pStyle w:val="BodyText"/>
+        <w:numPr>
+          <w:ilvl w:val="0"/>
+          <w:numId w:val="103"/>
+        </w:numPr>
+        <w:tabs>
+          <w:tab w:val="clear" w:pos="709"/>
+          <w:tab w:val="left" w:pos="0" w:leader="none"/>
+        </w:tabs>
+        <w:spacing w:before="0" w:after="0"/>
+        <w:ind w:hanging="283" w:start="709"/>
+        <w:rPr/>
+      </w:pPr>
+      <w:r>
+        <w:rPr/>
+        <w:t>Distance to Node 8: 14</w:t>
+      </w:r>
+    </w:p>
+    <w:p>
+      <w:pPr>
+        <w:pStyle w:val="BodyText"/>
+        <w:numPr>
+          <w:ilvl w:val="0"/>
+          <w:numId w:val="103"/>
+        </w:numPr>
+        <w:tabs>
+          <w:tab w:val="clear" w:pos="709"/>
+          <w:tab w:val="left" w:pos="0" w:leader="none"/>
+        </w:tabs>
+        <w:spacing w:before="0" w:after="0"/>
+        <w:ind w:hanging="283" w:start="709"/>
+        <w:rPr/>
+      </w:pPr>
+      <w:r>
+        <w:rPr/>
+        <w:t>Distance to Node 3: 19</w:t>
+      </w:r>
+    </w:p>
+    <w:p>
+      <w:pPr>
+        <w:pStyle w:val="BodyText"/>
+        <w:numPr>
+          <w:ilvl w:val="0"/>
+          <w:numId w:val="103"/>
+        </w:numPr>
+        <w:tabs>
+          <w:tab w:val="clear" w:pos="709"/>
+          <w:tab w:val="left" w:pos="0" w:leader="none"/>
+        </w:tabs>
+        <w:ind w:hanging="283" w:start="709"/>
+        <w:rPr/>
+      </w:pPr>
+      <w:r>
+        <w:rPr/>
+        <w:t>Distance to Node 4: 21</w:t>
+      </w:r>
+    </w:p>
+    <w:p>
+      <w:pPr>
+        <w:pStyle w:val="Heading3"/>
+        <w:rPr/>
+      </w:pPr>
+      <w:r>
+        <w:rPr>
+          <w:rStyle w:val="Strong"/>
+          <w:b/>
+          <w:bCs/>
+        </w:rPr>
+        <w:t>Paths</w:t>
+      </w:r>
+      <w:r>
+        <w:rPr/>
+        <w:t>:</w:t>
+      </w:r>
+    </w:p>
+    <w:p>
+      <w:pPr>
+        <w:pStyle w:val="BodyText"/>
+        <w:numPr>
+          <w:ilvl w:val="0"/>
+          <w:numId w:val="104"/>
+        </w:numPr>
+        <w:tabs>
+          <w:tab w:val="clear" w:pos="709"/>
+          <w:tab w:val="left" w:pos="0" w:leader="none"/>
+        </w:tabs>
+        <w:spacing w:before="0" w:after="0"/>
+        <w:ind w:hanging="283" w:start="709"/>
+        <w:rPr/>
+      </w:pPr>
+      <w:r>
+        <w:rPr/>
+        <w:t>Node 0: [0]</w:t>
+      </w:r>
+    </w:p>
+    <w:p>
+      <w:pPr>
+        <w:pStyle w:val="BodyText"/>
+        <w:numPr>
+          <w:ilvl w:val="0"/>
+          <w:numId w:val="104"/>
+        </w:numPr>
+        <w:tabs>
+          <w:tab w:val="clear" w:pos="709"/>
+          <w:tab w:val="left" w:pos="0" w:leader="none"/>
+        </w:tabs>
+        <w:spacing w:before="0" w:after="0"/>
+        <w:ind w:hanging="283" w:start="709"/>
+        <w:rPr/>
+      </w:pPr>
+      <w:r>
+        <w:rPr/>
+        <w:t>Node 1: [0, 1]</w:t>
+      </w:r>
+    </w:p>
+    <w:p>
+      <w:pPr>
+        <w:pStyle w:val="BodyText"/>
+        <w:numPr>
+          <w:ilvl w:val="0"/>
+          <w:numId w:val="104"/>
+        </w:numPr>
+        <w:tabs>
+          <w:tab w:val="clear" w:pos="709"/>
+          <w:tab w:val="left" w:pos="0" w:leader="none"/>
+        </w:tabs>
+        <w:spacing w:before="0" w:after="0"/>
+        <w:ind w:hanging="283" w:start="709"/>
+        <w:rPr/>
+      </w:pPr>
+      <w:r>
+        <w:rPr/>
+        <w:t>Node 7: [0, 7]</w:t>
+      </w:r>
+    </w:p>
+    <w:p>
+      <w:pPr>
+        <w:pStyle w:val="BodyText"/>
+        <w:numPr>
+          <w:ilvl w:val="0"/>
+          <w:numId w:val="104"/>
+        </w:numPr>
+        <w:tabs>
+          <w:tab w:val="clear" w:pos="709"/>
+          <w:tab w:val="left" w:pos="0" w:leader="none"/>
+        </w:tabs>
+        <w:spacing w:before="0" w:after="0"/>
+        <w:ind w:hanging="283" w:start="709"/>
+        <w:rPr/>
+      </w:pPr>
+      <w:r>
+        <w:rPr/>
+        <w:t>Node 6: [0, 7, 6]</w:t>
+      </w:r>
+    </w:p>
+    <w:p>
+      <w:pPr>
+        <w:pStyle w:val="BodyText"/>
+        <w:numPr>
+          <w:ilvl w:val="0"/>
+          <w:numId w:val="104"/>
+        </w:numPr>
+        <w:tabs>
+          <w:tab w:val="clear" w:pos="709"/>
+          <w:tab w:val="left" w:pos="0" w:leader="none"/>
+        </w:tabs>
+        <w:spacing w:before="0" w:after="0"/>
+        <w:ind w:hanging="283" w:start="709"/>
+        <w:rPr/>
+      </w:pPr>
+      <w:r>
+        <w:rPr/>
+        <w:t>Node 5: [0, 7, 6, 5]</w:t>
+      </w:r>
+    </w:p>
+    <w:p>
+      <w:pPr>
+        <w:pStyle w:val="BodyText"/>
+        <w:numPr>
+          <w:ilvl w:val="0"/>
+          <w:numId w:val="104"/>
+        </w:numPr>
+        <w:tabs>
+          <w:tab w:val="clear" w:pos="709"/>
+          <w:tab w:val="left" w:pos="0" w:leader="none"/>
+        </w:tabs>
+        <w:spacing w:before="0" w:after="0"/>
+        <w:ind w:hanging="283" w:start="709"/>
+        <w:rPr/>
+      </w:pPr>
+      <w:r>
+        <w:rPr/>
+        <w:t>Node 2: [0, 1, 2]</w:t>
+      </w:r>
+    </w:p>
+    <w:p>
+      <w:pPr>
+        <w:pStyle w:val="BodyText"/>
+        <w:numPr>
+          <w:ilvl w:val="0"/>
+          <w:numId w:val="104"/>
+        </w:numPr>
+        <w:tabs>
+          <w:tab w:val="clear" w:pos="709"/>
+          <w:tab w:val="left" w:pos="0" w:leader="none"/>
+        </w:tabs>
+        <w:spacing w:before="0" w:after="0"/>
+        <w:ind w:hanging="283" w:start="709"/>
+        <w:rPr/>
+      </w:pPr>
+      <w:r>
+        <w:rPr/>
+        <w:t>Node 8: [0, 1, 2, 8]</w:t>
+      </w:r>
+    </w:p>
+    <w:p>
+      <w:pPr>
+        <w:pStyle w:val="BodyText"/>
+        <w:numPr>
+          <w:ilvl w:val="0"/>
+          <w:numId w:val="104"/>
+        </w:numPr>
+        <w:tabs>
+          <w:tab w:val="clear" w:pos="709"/>
+          <w:tab w:val="left" w:pos="0" w:leader="none"/>
+        </w:tabs>
+        <w:spacing w:before="0" w:after="0"/>
+        <w:ind w:hanging="283" w:start="709"/>
+        <w:rPr/>
+      </w:pPr>
+      <w:r>
+        <w:rPr/>
+        <w:t>Node 3: [0, 1, 2, 3]</w:t>
+      </w:r>
+    </w:p>
+    <w:p>
+      <w:pPr>
+        <w:pStyle w:val="BodyText"/>
+        <w:numPr>
+          <w:ilvl w:val="0"/>
+          <w:numId w:val="104"/>
+        </w:numPr>
+        <w:tabs>
+          <w:tab w:val="clear" w:pos="709"/>
+          <w:tab w:val="left" w:pos="0" w:leader="none"/>
+        </w:tabs>
+        <w:ind w:hanging="283" w:start="709"/>
+        <w:rPr/>
+      </w:pPr>
+      <w:r>
+        <w:rPr/>
+        <w:t>Node 4: [0, 7, 6, 5, 4]</w:t>
       </w:r>
     </w:p>
     <w:p>
@@ -6857,7 +7301,7 @@
       </w:pPr>
       <w:r>
         <w:rPr/>
-        <w:t>Update distances and heap: distances=[0,4,∞,∞,∞,∞,∞,8,∞] \text{min_heap} = [(4, 1)]</w:t>
+        <w:t>Update distances and heap: distances=[0,4,∞,∞,∞,∞,∞,8,∞]  = [(4, 1)]</w:t>
       </w:r>
     </w:p>
     <w:p>
@@ -6916,7 +7360,7 @@
       </w:pPr>
       <w:r>
         <w:rPr/>
-        <w:t>Update distances and heap: distances=[0,4,∞,∞,∞,∞,∞,8,∞] \text{min_heap} = [(4, 1), (8, 7)]</w:t>
+        <w:t>Update distances and heap: distances=[0,4,∞,∞,∞,∞,∞,8,∞] = [(4, 1), (8, 7)]</w:t>
       </w:r>
     </w:p>
     <w:p>
@@ -7087,7 +7531,7 @@
       </w:pPr>
       <w:r>
         <w:rPr/>
-        <w:t>Update distances and heap: distances=[0,4,12,∞,∞,∞,∞,8,∞] \text{min_heap} = [(8, 7), (12, 2)]</w:t>
+        <w:t>Update distances and heap: distances=[0,4,12,∞,∞,∞,∞,8,∞] = [(8, 7), (12, 2)]</w:t>
       </w:r>
     </w:p>
     <w:p>
@@ -7322,7 +7766,7 @@
       </w:pPr>
       <w:r>
         <w:rPr/>
-        <w:t>Update distances and heap: distances=[0,4,12,∞,∞,∞,∞,8,15] \text{min_heap} = [(12, 2), (15, 8)]</w:t>
+        <w:t>Update distances and heap: distances=[0,4,12,∞,∞,∞,∞,8,15] = [(12, 2), (15, 8)]</w:t>
       </w:r>
     </w:p>
     <w:p>
@@ -7381,7 +7825,7 @@
       </w:pPr>
       <w:r>
         <w:rPr/>
-        <w:t>Update distances and heap: distances=[0,4,12,∞,∞,∞,9,8,15] \text{min_heap} = [(9, 6), (15, 8), (12, 2)]</w:t>
+        <w:t>Update distances and heap: distances=[0,4,12,∞,∞,∞,9,8,15] = [(9, 6), (15, 8), (12, 2)]</w:t>
       </w:r>
     </w:p>
     <w:p>
@@ -7520,7 +7964,7 @@
       </w:pPr>
       <w:r>
         <w:rPr/>
-        <w:t>Update distances and heap: distances=[0,4,12,∞,∞,11,9,8,15] \text{min_heap} = [(11, 5), (15, 8), (12, 2)]</w:t>
+        <w:t>Update distances and heap: distances=[0,4,12,∞,∞,11,9,8,15] = [(11, 5), (15, 8), (12, 2)]</w:t>
       </w:r>
     </w:p>
     <w:p>
@@ -7723,7 +8167,7 @@
       </w:pPr>
       <w:r>
         <w:rPr/>
-        <w:t>Update distances and heap: distances=[0,4,12,∞,21,11,9,8,15] \text{min_heap} = [(12, 2), (15, 8), (21, 4)]</w:t>
+        <w:t>Update distances and heap: distances=[0,4,12,∞,21,11,9,8,15] = [(12, 2), (15, 8), (21, 4)]</w:t>
       </w:r>
     </w:p>
     <w:p>
@@ -7782,7 +8226,7 @@
       </w:pPr>
       <w:r>
         <w:rPr/>
-        <w:t>Update distances and heap: distances=[0,4,12,25,21,11,9,8,15] \text{min_heap} = [(12, 2), (15, 8), (21, 4), (25, 3)]</w:t>
+        <w:t>Update distances and heap: distances=[0,4,12,25,21,11,9,8,15] = [(12, 2), (15, 8), (21, 4), (25, 3)]</w:t>
       </w:r>
     </w:p>
     <w:p>
@@ -8017,7 +8461,7 @@
       </w:pPr>
       <w:r>
         <w:rPr/>
-        <w:t>Update distances and heap: distances=[0,4,12,19,21,11,9,8,15] \text{min_heap} = [(15, 8), (21, 4), (25, 3), (19, 3)]</w:t>
+        <w:t>Update distances and heap: distances=[0,4,12,19,21,11,9,8,15] = [(15, 8), (21, 4), (25, 3), (19, 3)]</w:t>
       </w:r>
     </w:p>
     <w:p>
@@ -8049,7 +8493,7 @@
       </w:pPr>
       <w:r>
         <w:rPr/>
-        <w:t>Current distance to Node 8 is 15, and 12+2=14. Update: distances=[0,4,12,19,21,11,9,8,14] \text{min_heap} = [(14, 8), (21, 4), (25, 3), (19, 3)]</w:t>
+        <w:t>Current distance to Node 8 is 15, and 12+2=14. Update: distances=[0,4,12,19,21,11,9,8,14] = [(14, 8), (21, 4), (25, 3), (19, 3)]</w:t>
       </w:r>
     </w:p>
     <w:p>
@@ -10633,10 +11077,15 @@
         <w:jc w:val="start"/>
         <w:rPr>
           <w:rStyle w:val="Strong"/>
-        </w:rPr>
-      </w:pPr>
-      <w:r>
-        <w:rPr/>
+          <w:b w:val="false"/>
+          <w:bCs w:val="false"/>
+        </w:rPr>
+      </w:pPr>
+      <w:r>
+        <w:rPr>
+          <w:b w:val="false"/>
+          <w:bCs w:val="false"/>
+        </w:rPr>
       </w:r>
     </w:p>
     <w:p>
@@ -10653,15 +11102,7 @@
           <w:b/>
           <w:bCs/>
         </w:rPr>
-        <w:t xml:space="preserve">9. </w:t>
-      </w:r>
-      <w:r>
-        <w:rPr>
-          <w:rStyle w:val="Strong"/>
-          <w:b/>
-          <w:bCs/>
-        </w:rPr>
-        <w:t>Workthrough: Greedy Algorithm to Minimize the Maximum Difference Between Heights</w:t>
+        <w:t>9. Workthrough: Greedy Algorithm to Minimize the Maximum Difference Between Heights</w:t>
       </w:r>
     </w:p>
     <w:p>
@@ -26735,6 +27176,280 @@
   <w:abstractNum w:abstractNumId="103">
     <w:lvl w:ilvl="0">
       <w:start w:val="1"/>
+      <w:numFmt w:val="bullet"/>
+      <w:lvlText w:val=""/>
+      <w:lvlJc w:val="start"/>
+      <w:pPr>
+        <w:tabs>
+          <w:tab w:val="num" w:pos="709"/>
+        </w:tabs>
+        <w:ind w:start="709" w:hanging="283"/>
+      </w:pPr>
+      <w:rPr>
+        <w:rFonts w:ascii="Symbol" w:hAnsi="Symbol" w:cs="Symbol" w:hint="default"/>
+      </w:rPr>
+    </w:lvl>
+    <w:lvl w:ilvl="1">
+      <w:start w:val="1"/>
+      <w:numFmt w:val="bullet"/>
+      <w:lvlText w:val=""/>
+      <w:lvlJc w:val="start"/>
+      <w:pPr>
+        <w:tabs>
+          <w:tab w:val="num" w:pos="1418"/>
+        </w:tabs>
+        <w:ind w:start="1418" w:hanging="283"/>
+      </w:pPr>
+      <w:rPr>
+        <w:rFonts w:ascii="Symbol" w:hAnsi="Symbol" w:cs="Symbol" w:hint="default"/>
+      </w:rPr>
+    </w:lvl>
+    <w:lvl w:ilvl="2">
+      <w:start w:val="1"/>
+      <w:numFmt w:val="bullet"/>
+      <w:lvlText w:val=""/>
+      <w:lvlJc w:val="start"/>
+      <w:pPr>
+        <w:tabs>
+          <w:tab w:val="num" w:pos="2127"/>
+        </w:tabs>
+        <w:ind w:start="2127" w:hanging="283"/>
+      </w:pPr>
+      <w:rPr>
+        <w:rFonts w:ascii="Symbol" w:hAnsi="Symbol" w:cs="Symbol" w:hint="default"/>
+      </w:rPr>
+    </w:lvl>
+    <w:lvl w:ilvl="3">
+      <w:start w:val="1"/>
+      <w:numFmt w:val="bullet"/>
+      <w:lvlText w:val=""/>
+      <w:lvlJc w:val="start"/>
+      <w:pPr>
+        <w:tabs>
+          <w:tab w:val="num" w:pos="2836"/>
+        </w:tabs>
+        <w:ind w:start="2836" w:hanging="283"/>
+      </w:pPr>
+      <w:rPr>
+        <w:rFonts w:ascii="Symbol" w:hAnsi="Symbol" w:cs="Symbol" w:hint="default"/>
+      </w:rPr>
+    </w:lvl>
+    <w:lvl w:ilvl="4">
+      <w:start w:val="1"/>
+      <w:numFmt w:val="bullet"/>
+      <w:lvlText w:val=""/>
+      <w:lvlJc w:val="start"/>
+      <w:pPr>
+        <w:tabs>
+          <w:tab w:val="num" w:pos="3545"/>
+        </w:tabs>
+        <w:ind w:start="3545" w:hanging="283"/>
+      </w:pPr>
+      <w:rPr>
+        <w:rFonts w:ascii="Symbol" w:hAnsi="Symbol" w:cs="Symbol" w:hint="default"/>
+      </w:rPr>
+    </w:lvl>
+    <w:lvl w:ilvl="5">
+      <w:start w:val="1"/>
+      <w:numFmt w:val="bullet"/>
+      <w:lvlText w:val=""/>
+      <w:lvlJc w:val="start"/>
+      <w:pPr>
+        <w:tabs>
+          <w:tab w:val="num" w:pos="4254"/>
+        </w:tabs>
+        <w:ind w:start="4254" w:hanging="283"/>
+      </w:pPr>
+      <w:rPr>
+        <w:rFonts w:ascii="Symbol" w:hAnsi="Symbol" w:cs="Symbol" w:hint="default"/>
+      </w:rPr>
+    </w:lvl>
+    <w:lvl w:ilvl="6">
+      <w:start w:val="1"/>
+      <w:numFmt w:val="bullet"/>
+      <w:lvlText w:val=""/>
+      <w:lvlJc w:val="start"/>
+      <w:pPr>
+        <w:tabs>
+          <w:tab w:val="num" w:pos="4963"/>
+        </w:tabs>
+        <w:ind w:start="4963" w:hanging="283"/>
+      </w:pPr>
+      <w:rPr>
+        <w:rFonts w:ascii="Symbol" w:hAnsi="Symbol" w:cs="Symbol" w:hint="default"/>
+      </w:rPr>
+    </w:lvl>
+    <w:lvl w:ilvl="7">
+      <w:start w:val="1"/>
+      <w:numFmt w:val="bullet"/>
+      <w:lvlText w:val=""/>
+      <w:lvlJc w:val="start"/>
+      <w:pPr>
+        <w:tabs>
+          <w:tab w:val="num" w:pos="5672"/>
+        </w:tabs>
+        <w:ind w:start="5672" w:hanging="283"/>
+      </w:pPr>
+      <w:rPr>
+        <w:rFonts w:ascii="Symbol" w:hAnsi="Symbol" w:cs="Symbol" w:hint="default"/>
+      </w:rPr>
+    </w:lvl>
+    <w:lvl w:ilvl="8">
+      <w:start w:val="1"/>
+      <w:numFmt w:val="bullet"/>
+      <w:lvlText w:val=""/>
+      <w:lvlJc w:val="start"/>
+      <w:pPr>
+        <w:tabs>
+          <w:tab w:val="num" w:pos="6381"/>
+        </w:tabs>
+        <w:ind w:start="6381" w:hanging="283"/>
+      </w:pPr>
+      <w:rPr>
+        <w:rFonts w:ascii="Symbol" w:hAnsi="Symbol" w:cs="Symbol" w:hint="default"/>
+      </w:rPr>
+    </w:lvl>
+  </w:abstractNum>
+  <w:abstractNum w:abstractNumId="104">
+    <w:lvl w:ilvl="0">
+      <w:start w:val="1"/>
+      <w:numFmt w:val="bullet"/>
+      <w:lvlText w:val=""/>
+      <w:lvlJc w:val="start"/>
+      <w:pPr>
+        <w:tabs>
+          <w:tab w:val="num" w:pos="709"/>
+        </w:tabs>
+        <w:ind w:start="709" w:hanging="283"/>
+      </w:pPr>
+      <w:rPr>
+        <w:rFonts w:ascii="Symbol" w:hAnsi="Symbol" w:cs="Symbol" w:hint="default"/>
+      </w:rPr>
+    </w:lvl>
+    <w:lvl w:ilvl="1">
+      <w:start w:val="1"/>
+      <w:numFmt w:val="bullet"/>
+      <w:lvlText w:val=""/>
+      <w:lvlJc w:val="start"/>
+      <w:pPr>
+        <w:tabs>
+          <w:tab w:val="num" w:pos="1418"/>
+        </w:tabs>
+        <w:ind w:start="1418" w:hanging="283"/>
+      </w:pPr>
+      <w:rPr>
+        <w:rFonts w:ascii="Symbol" w:hAnsi="Symbol" w:cs="Symbol" w:hint="default"/>
+      </w:rPr>
+    </w:lvl>
+    <w:lvl w:ilvl="2">
+      <w:start w:val="1"/>
+      <w:numFmt w:val="bullet"/>
+      <w:lvlText w:val=""/>
+      <w:lvlJc w:val="start"/>
+      <w:pPr>
+        <w:tabs>
+          <w:tab w:val="num" w:pos="2127"/>
+        </w:tabs>
+        <w:ind w:start="2127" w:hanging="283"/>
+      </w:pPr>
+      <w:rPr>
+        <w:rFonts w:ascii="Symbol" w:hAnsi="Symbol" w:cs="Symbol" w:hint="default"/>
+      </w:rPr>
+    </w:lvl>
+    <w:lvl w:ilvl="3">
+      <w:start w:val="1"/>
+      <w:numFmt w:val="bullet"/>
+      <w:lvlText w:val=""/>
+      <w:lvlJc w:val="start"/>
+      <w:pPr>
+        <w:tabs>
+          <w:tab w:val="num" w:pos="2836"/>
+        </w:tabs>
+        <w:ind w:start="2836" w:hanging="283"/>
+      </w:pPr>
+      <w:rPr>
+        <w:rFonts w:ascii="Symbol" w:hAnsi="Symbol" w:cs="Symbol" w:hint="default"/>
+      </w:rPr>
+    </w:lvl>
+    <w:lvl w:ilvl="4">
+      <w:start w:val="1"/>
+      <w:numFmt w:val="bullet"/>
+      <w:lvlText w:val=""/>
+      <w:lvlJc w:val="start"/>
+      <w:pPr>
+        <w:tabs>
+          <w:tab w:val="num" w:pos="3545"/>
+        </w:tabs>
+        <w:ind w:start="3545" w:hanging="283"/>
+      </w:pPr>
+      <w:rPr>
+        <w:rFonts w:ascii="Symbol" w:hAnsi="Symbol" w:cs="Symbol" w:hint="default"/>
+      </w:rPr>
+    </w:lvl>
+    <w:lvl w:ilvl="5">
+      <w:start w:val="1"/>
+      <w:numFmt w:val="bullet"/>
+      <w:lvlText w:val=""/>
+      <w:lvlJc w:val="start"/>
+      <w:pPr>
+        <w:tabs>
+          <w:tab w:val="num" w:pos="4254"/>
+        </w:tabs>
+        <w:ind w:start="4254" w:hanging="283"/>
+      </w:pPr>
+      <w:rPr>
+        <w:rFonts w:ascii="Symbol" w:hAnsi="Symbol" w:cs="Symbol" w:hint="default"/>
+      </w:rPr>
+    </w:lvl>
+    <w:lvl w:ilvl="6">
+      <w:start w:val="1"/>
+      <w:numFmt w:val="bullet"/>
+      <w:lvlText w:val=""/>
+      <w:lvlJc w:val="start"/>
+      <w:pPr>
+        <w:tabs>
+          <w:tab w:val="num" w:pos="4963"/>
+        </w:tabs>
+        <w:ind w:start="4963" w:hanging="283"/>
+      </w:pPr>
+      <w:rPr>
+        <w:rFonts w:ascii="Symbol" w:hAnsi="Symbol" w:cs="Symbol" w:hint="default"/>
+      </w:rPr>
+    </w:lvl>
+    <w:lvl w:ilvl="7">
+      <w:start w:val="1"/>
+      <w:numFmt w:val="bullet"/>
+      <w:lvlText w:val=""/>
+      <w:lvlJc w:val="start"/>
+      <w:pPr>
+        <w:tabs>
+          <w:tab w:val="num" w:pos="5672"/>
+        </w:tabs>
+        <w:ind w:start="5672" w:hanging="283"/>
+      </w:pPr>
+      <w:rPr>
+        <w:rFonts w:ascii="Symbol" w:hAnsi="Symbol" w:cs="Symbol" w:hint="default"/>
+      </w:rPr>
+    </w:lvl>
+    <w:lvl w:ilvl="8">
+      <w:start w:val="1"/>
+      <w:numFmt w:val="bullet"/>
+      <w:lvlText w:val=""/>
+      <w:lvlJc w:val="start"/>
+      <w:pPr>
+        <w:tabs>
+          <w:tab w:val="num" w:pos="6381"/>
+        </w:tabs>
+        <w:ind w:start="6381" w:hanging="283"/>
+      </w:pPr>
+      <w:rPr>
+        <w:rFonts w:ascii="Symbol" w:hAnsi="Symbol" w:cs="Symbol" w:hint="default"/>
+      </w:rPr>
+    </w:lvl>
+  </w:abstractNum>
+  <w:abstractNum w:abstractNumId="105">
+    <w:lvl w:ilvl="0">
+      <w:start w:val="1"/>
       <w:numFmt w:val="none"/>
       <w:suff w:val="nothing"/>
       <w:lvlText w:val=""/>
@@ -26748,7 +27463,6 @@
     </w:lvl>
     <w:lvl w:ilvl="1">
       <w:start w:val="1"/>
-      <w:pStyle w:val="Heading2"/>
       <w:numFmt w:val="none"/>
       <w:suff w:val="nothing"/>
       <w:lvlText w:val=""/>
@@ -26788,7 +27502,6 @@
     </w:lvl>
     <w:lvl w:ilvl="4">
       <w:start w:val="1"/>
-      <w:pStyle w:val="Heading5"/>
       <w:numFmt w:val="none"/>
       <w:suff w:val="nothing"/>
       <w:lvlText w:val=""/>
@@ -27161,6 +27874,12 @@
   </w:num>
   <w:num w:numId="103">
     <w:abstractNumId w:val="103"/>
+  </w:num>
+  <w:num w:numId="104">
+    <w:abstractNumId w:val="104"/>
+  </w:num>
+  <w:num w:numId="105">
+    <w:abstractNumId w:val="105"/>
   </w:num>
 </w:numbering>
 </file>

</xml_diff>

<commit_message>
update Workthrough: Dijkstra’s Shortest Path Algorithm
</commit_message>
<xml_diff>
--- a/problem_solving_techniques/Phase 2: Algorithms Mastery/greedy algorithms/greedy_workthout_example_on_solving_problems.docx
+++ b/problem_solving_techniques/Phase 2: Algorithms Mastery/greedy algorithms/greedy_workthout_example_on_solving_problems.docx
@@ -6347,17 +6347,54 @@
         <w:rPr>
           <w:rStyle w:val="Strong"/>
         </w:rPr>
-        <w:t>shortest distances from Node 0 to all other nodes</w:t>
-      </w:r>
-      <w:r>
-        <w:rPr/>
-        <w:t xml:space="preserve"> using </w:t>
-      </w:r>
+        <w:t>Workthrough: Dijkstra’s Shortest Path Algorithm</w:t>
+      </w:r>
+    </w:p>
+    <w:p>
+      <w:pPr>
+        <w:pStyle w:val="HorizontalLine"/>
+        <w:rPr/>
+      </w:pPr>
+      <w:r>
+        <w:rPr/>
+      </w:r>
+    </w:p>
+    <w:p>
+      <w:pPr>
+        <w:pStyle w:val="Heading3"/>
+        <w:rPr/>
+      </w:pPr>
       <w:r>
         <w:rPr>
           <w:rStyle w:val="Strong"/>
-        </w:rPr>
-        <w:t>Dijkstra’s</w:t>
+          <w:b/>
+          <w:bCs/>
+        </w:rPr>
+        <w:t>Problem Description</w:t>
+      </w:r>
+    </w:p>
+    <w:p>
+      <w:pPr>
+        <w:pStyle w:val="BodyText"/>
+        <w:rPr/>
+      </w:pPr>
+      <w:r>
+        <w:rPr/>
+        <w:t>The goal is to find the shortest distance from a given source node to all other nodes in a weighted graph. Dijkstra’s algorithm uses a greedy approach and ensures that the shortest path to each node is discovered.</w:t>
+      </w:r>
+    </w:p>
+    <w:p>
+      <w:pPr>
+        <w:pStyle w:val="BodyText"/>
+        <w:bidi w:val="0"/>
+        <w:spacing w:lineRule="auto" w:line="276" w:before="0" w:after="140"/>
+        <w:jc w:val="start"/>
+        <w:rPr>
+          <w:rStyle w:val="Strong"/>
+        </w:rPr>
+      </w:pPr>
+      <w:r>
+        <w:rPr/>
       </w:r>
     </w:p>
     <w:p>

</xml_diff>